<commit_message>
Add in-memory attachment scanner, VirusTotal lookup, email risk rebalancing, and updated design doc diagrams
</commit_message>
<xml_diff>
--- a/docs/PhishGuard_Design_Document_Final_Report.docx
+++ b/docs/PhishGuard_Design_Document_Final_Report.docx
@@ -25,16 +25,16 @@
           <w:rFonts w:ascii="Arial" w:hAnsi="Arial"/>
           <w:b/>
           <w:color w:val="374151"/>
-          <w:sz w:val="28"/>
+          <w:sz w:val="26"/>
         </w:rPr>
         <w:t>Design Document &amp; System Architecture</w:t>
         <w:br/>
-        <w:t>Functional Block Diagram and UML Diagrams (Updated Final Report)</w:t>
+        <w:t>Functional Block Diagram and UML Diagrams (Final Report)</w:t>
       </w:r>
     </w:p>
     <w:p>
       <w:pPr>
-        <w:spacing w:after="280"/>
+        <w:spacing w:after="240"/>
         <w:jc w:val="center"/>
       </w:pPr>
       <w:r>
@@ -331,7 +331,7 @@
     </w:tbl>
     <w:p>
       <w:pPr>
-        <w:spacing w:after="200"/>
+        <w:spacing w:after="160"/>
       </w:pPr>
     </w:p>
     <w:p>
@@ -370,7 +370,7 @@
         <w:spacing w:line="276" w:lineRule="auto" w:after="240"/>
       </w:pPr>
       <w:r>
-        <w:t>This document describes the design and technical architecture of the PhishGuard platform using a functional block diagram and UML diagrams (class diagram, state transition diagram, and sequence diagrams), fully updated to reflect the production source code in the repository.</w:t>
+        <w:t>This document describes the design and technical architecture of the PhishGuard platform using a functional block diagram and three types of UML diagrams: class diagrams, a state transition diagram, and sequence diagrams, fully updated to reflect the production source code in the repository.</w:t>
       </w:r>
     </w:p>
     <w:p>
@@ -390,10 +390,65 @@
     </w:p>
     <w:p>
       <w:pPr>
-        <w:spacing w:line="276" w:lineRule="auto" w:after="160"/>
+        <w:spacing w:line="276" w:lineRule="auto" w:after="120"/>
       </w:pPr>
       <w:r>
         <w:t>Figure 1 shows the main functional blocks of PhishGuard and the data flow between them. The user interacts exclusively with the frontend dashboard. The dashboard communicates with the FastAPI backend over REST (JSON). The backend coordinates the feature acquisition layer, queries external threat intelligence and verification services (Google Safe Browsing, Disify Free Email API, live DNS and WHOIS), executes the analysis and ML layers, and synthesizes the final explainable response.</w:t>
+      </w:r>
+    </w:p>
+    <w:p>
+      <w:pPr>
+        <w:spacing w:before="160" w:after="40"/>
+        <w:jc w:val="center"/>
+      </w:pPr>
+      <w:r>
+        <w:drawing>
+          <wp:inline xmlns:a="http://schemas.openxmlformats.org/drawingml/2006/main" xmlns:pic="http://schemas.openxmlformats.org/drawingml/2006/picture">
+            <wp:extent cx="5669280" cy="4905140"/>
+            <wp:docPr id="1" name="Picture 1"/>
+            <wp:cNvGraphicFramePr>
+              <a:graphicFrameLocks noChangeAspect="1"/>
+            </wp:cNvGraphicFramePr>
+            <a:graphic>
+              <a:graphicData uri="http://schemas.openxmlformats.org/drawingml/2006/picture">
+                <pic:pic>
+                  <pic:nvPicPr>
+                    <pic:cNvPr id="0" name="page_2_img_1_Image15.png"/>
+                    <pic:cNvPicPr/>
+                  </pic:nvPicPr>
+                  <pic:blipFill>
+                    <a:blip r:embed="rId9"/>
+                    <a:stretch>
+                      <a:fillRect/>
+                    </a:stretch>
+                  </pic:blipFill>
+                  <pic:spPr>
+                    <a:xfrm>
+                      <a:off x="0" y="0"/>
+                      <a:ext cx="5669280" cy="4905140"/>
+                    </a:xfrm>
+                    <a:prstGeom prst="rect"/>
+                  </pic:spPr>
+                </pic:pic>
+              </a:graphicData>
+            </a:graphic>
+          </wp:inline>
+        </w:drawing>
+      </w:r>
+    </w:p>
+    <w:p>
+      <w:pPr>
+        <w:spacing w:after="240"/>
+        <w:jc w:val="center"/>
+      </w:pPr>
+      <w:r>
+        <w:rPr>
+          <w:rFonts w:ascii="Calibri" w:hAnsi="Calibri"/>
+          <w:i/>
+          <w:color w:val="4B5563"/>
+          <w:sz w:val="20"/>
+        </w:rPr>
+        <w:t>Figure 1: Functional block diagram of PhishGuard</w:t>
       </w:r>
     </w:p>
     <w:p>
@@ -1207,7 +1262,7 @@
     </w:p>
     <w:p>
       <w:pPr>
-        <w:spacing w:line="276" w:lineRule="auto" w:after="160"/>
+        <w:spacing w:line="276" w:lineRule="auto" w:after="120"/>
       </w:pPr>
       <w:r>
         <w:t>The class model is divided into two logical diagrams. Figure 2 illustrates the data models and the central FastAPI application interface. Request and response schemas inherit from Pydantic's BaseModel to guarantee strict data validation, serialization, and OpenAPI compliance. PhishGuardAPI encapsulates the REST routing endpoints, request handling, and response synthesis.</w:t>
@@ -1215,10 +1270,120 @@
     </w:p>
     <w:p>
       <w:pPr>
-        <w:spacing w:line="276" w:lineRule="auto" w:after="160"/>
+        <w:spacing w:before="160" w:after="40"/>
+        <w:jc w:val="center"/>
       </w:pPr>
       <w:r>
-        <w:t>Figure 3 shows the service and engine components utilized by the PhishGuard backend. Python modules containing specialized functions are represented as stereotyped service classes, emphasizing loose coupling and modular separation of concerns.</w:t>
+        <w:drawing>
+          <wp:inline xmlns:a="http://schemas.openxmlformats.org/drawingml/2006/main" xmlns:pic="http://schemas.openxmlformats.org/drawingml/2006/picture">
+            <wp:extent cx="5303520" cy="5990750"/>
+            <wp:docPr id="2" name="Picture 2"/>
+            <wp:cNvGraphicFramePr>
+              <a:graphicFrameLocks noChangeAspect="1"/>
+            </wp:cNvGraphicFramePr>
+            <a:graphic>
+              <a:graphicData uri="http://schemas.openxmlformats.org/drawingml/2006/picture">
+                <pic:pic>
+                  <pic:nvPicPr>
+                    <pic:cNvPr id="0" name="page_4_img_1_Image20.png"/>
+                    <pic:cNvPicPr/>
+                  </pic:nvPicPr>
+                  <pic:blipFill>
+                    <a:blip r:embed="rId10"/>
+                    <a:stretch>
+                      <a:fillRect/>
+                    </a:stretch>
+                  </pic:blipFill>
+                  <pic:spPr>
+                    <a:xfrm>
+                      <a:off x="0" y="0"/>
+                      <a:ext cx="5303520" cy="5990750"/>
+                    </a:xfrm>
+                    <a:prstGeom prst="rect"/>
+                  </pic:spPr>
+                </pic:pic>
+              </a:graphicData>
+            </a:graphic>
+          </wp:inline>
+        </w:drawing>
+      </w:r>
+    </w:p>
+    <w:p>
+      <w:pPr>
+        <w:spacing w:after="240"/>
+        <w:jc w:val="center"/>
+      </w:pPr>
+      <w:r>
+        <w:rPr>
+          <w:rFonts w:ascii="Calibri" w:hAnsi="Calibri"/>
+          <w:i/>
+          <w:color w:val="4B5563"/>
+          <w:sz w:val="20"/>
+        </w:rPr>
+        <w:t>Figure 2: Class diagram - Data models and API interface</w:t>
+      </w:r>
+    </w:p>
+    <w:p>
+      <w:pPr>
+        <w:spacing w:line="276" w:lineRule="auto" w:after="120"/>
+      </w:pPr>
+      <w:r>
+        <w:t>Figure 3 shows the service and engine components utilized by the PhishGuard backend. Python modules containing specialized functions are represented as stereotyped service classes, emphasizing loose coupling and modular separation of concerns. PhishGuardAPI coordinates these services depending on whether URL inspection, deep page scraping, or email analysis is invoked.</w:t>
+      </w:r>
+    </w:p>
+    <w:p>
+      <w:pPr>
+        <w:spacing w:before="160" w:after="40"/>
+        <w:jc w:val="center"/>
+      </w:pPr>
+      <w:r>
+        <w:drawing>
+          <wp:inline xmlns:a="http://schemas.openxmlformats.org/drawingml/2006/main" xmlns:pic="http://schemas.openxmlformats.org/drawingml/2006/picture">
+            <wp:extent cx="5486400" cy="5203002"/>
+            <wp:docPr id="3" name="Picture 3"/>
+            <wp:cNvGraphicFramePr>
+              <a:graphicFrameLocks noChangeAspect="1"/>
+            </wp:cNvGraphicFramePr>
+            <a:graphic>
+              <a:graphicData uri="http://schemas.openxmlformats.org/drawingml/2006/picture">
+                <pic:pic>
+                  <pic:nvPicPr>
+                    <pic:cNvPr id="0" name="page_5_img_1_Image23.png"/>
+                    <pic:cNvPicPr/>
+                  </pic:nvPicPr>
+                  <pic:blipFill>
+                    <a:blip r:embed="rId11"/>
+                    <a:stretch>
+                      <a:fillRect/>
+                    </a:stretch>
+                  </pic:blipFill>
+                  <pic:spPr>
+                    <a:xfrm>
+                      <a:off x="0" y="0"/>
+                      <a:ext cx="5486400" cy="5203002"/>
+                    </a:xfrm>
+                    <a:prstGeom prst="rect"/>
+                  </pic:spPr>
+                </pic:pic>
+              </a:graphicData>
+            </a:graphic>
+          </wp:inline>
+        </w:drawing>
+      </w:r>
+    </w:p>
+    <w:p>
+      <w:pPr>
+        <w:spacing w:after="240"/>
+        <w:jc w:val="center"/>
+      </w:pPr>
+      <w:r>
+        <w:rPr>
+          <w:rFonts w:ascii="Calibri" w:hAnsi="Calibri"/>
+          <w:i/>
+          <w:color w:val="4B5563"/>
+          <w:sz w:val="20"/>
+        </w:rPr>
+        <w:t>Figure 3: Class diagram - Analysis and feature services</w:t>
       </w:r>
     </w:p>
     <w:p>
@@ -1238,10 +1403,65 @@
     </w:p>
     <w:p>
       <w:pPr>
-        <w:spacing w:line="276" w:lineRule="auto" w:after="160"/>
+        <w:spacing w:line="276" w:lineRule="auto" w:after="120"/>
       </w:pPr>
       <w:r>
         <w:t>Figure 4 illustrates the finite state lifecycle of an inspection request processed by the backend. A request transitions from Idle to Validating Input. Invalid payloads immediately transition to Rejected and return an HTTP 4xx response. Valid input progresses through parallel feature extraction, classification, explanation, and threat lookup states. If deep scraping is selected, the Page Analysis state verifies SSRF constraints and inspects DOM artifacts before entering the Risk Scoring state where hybrid heuristics and ML probabilities are synthesized.</w:t>
+      </w:r>
+    </w:p>
+    <w:p>
+      <w:pPr>
+        <w:spacing w:before="160" w:after="40"/>
+        <w:jc w:val="center"/>
+      </w:pPr>
+      <w:r>
+        <w:drawing>
+          <wp:inline xmlns:a="http://schemas.openxmlformats.org/drawingml/2006/main" xmlns:pic="http://schemas.openxmlformats.org/drawingml/2006/picture">
+            <wp:extent cx="5120640" cy="5385729"/>
+            <wp:docPr id="4" name="Picture 4"/>
+            <wp:cNvGraphicFramePr>
+              <a:graphicFrameLocks noChangeAspect="1"/>
+            </wp:cNvGraphicFramePr>
+            <a:graphic>
+              <a:graphicData uri="http://schemas.openxmlformats.org/drawingml/2006/picture">
+                <pic:pic>
+                  <pic:nvPicPr>
+                    <pic:cNvPr id="0" name="page_6_img_1_Image26.png"/>
+                    <pic:cNvPicPr/>
+                  </pic:nvPicPr>
+                  <pic:blipFill>
+                    <a:blip r:embed="rId12"/>
+                    <a:stretch>
+                      <a:fillRect/>
+                    </a:stretch>
+                  </pic:blipFill>
+                  <pic:spPr>
+                    <a:xfrm>
+                      <a:off x="0" y="0"/>
+                      <a:ext cx="5120640" cy="5385729"/>
+                    </a:xfrm>
+                    <a:prstGeom prst="rect"/>
+                  </pic:spPr>
+                </pic:pic>
+              </a:graphicData>
+            </a:graphic>
+          </wp:inline>
+        </w:drawing>
+      </w:r>
+    </w:p>
+    <w:p>
+      <w:pPr>
+        <w:spacing w:after="240"/>
+        <w:jc w:val="center"/>
+      </w:pPr>
+      <w:r>
+        <w:rPr>
+          <w:rFonts w:ascii="Calibri" w:hAnsi="Calibri"/>
+          <w:i/>
+          <w:color w:val="4B5563"/>
+          <w:sz w:val="20"/>
+        </w:rPr>
+        <w:t>Figure 4: State transition diagram of an analysis request</w:t>
       </w:r>
     </w:p>
     <w:p>
@@ -1261,7 +1481,7 @@
     </w:p>
     <w:p>
       <w:pPr>
-        <w:spacing w:line="276" w:lineRule="auto" w:after="160"/>
+        <w:spacing w:line="276" w:lineRule="auto" w:after="120"/>
       </w:pPr>
       <w:r>
         <w:t>Figure 5 details the end-to-end execution flow for standard URL analysis (POST /api/predict). The FastAPI backend sequentially invokes the URL feature extractor, network intelligence module, machine learning classifier, explainability engine, and threat intelligence service before calculating the risk score and returning the PredictionResponse to the client.</w:t>
@@ -1269,10 +1489,120 @@
     </w:p>
     <w:p>
       <w:pPr>
-        <w:spacing w:line="276" w:lineRule="auto" w:after="160"/>
+        <w:spacing w:before="160" w:after="40"/>
+        <w:jc w:val="center"/>
+      </w:pPr>
+      <w:r>
+        <w:drawing>
+          <wp:inline xmlns:a="http://schemas.openxmlformats.org/drawingml/2006/main" xmlns:pic="http://schemas.openxmlformats.org/drawingml/2006/picture">
+            <wp:extent cx="5303520" cy="5175245"/>
+            <wp:docPr id="5" name="Picture 5"/>
+            <wp:cNvGraphicFramePr>
+              <a:graphicFrameLocks noChangeAspect="1"/>
+            </wp:cNvGraphicFramePr>
+            <a:graphic>
+              <a:graphicData uri="http://schemas.openxmlformats.org/drawingml/2006/picture">
+                <pic:pic>
+                  <pic:nvPicPr>
+                    <pic:cNvPr id="0" name="page_7_img_1_Image29.png"/>
+                    <pic:cNvPicPr/>
+                  </pic:nvPicPr>
+                  <pic:blipFill>
+                    <a:blip r:embed="rId13"/>
+                    <a:stretch>
+                      <a:fillRect/>
+                    </a:stretch>
+                  </pic:blipFill>
+                  <pic:spPr>
+                    <a:xfrm>
+                      <a:off x="0" y="0"/>
+                      <a:ext cx="5303520" cy="5175245"/>
+                    </a:xfrm>
+                    <a:prstGeom prst="rect"/>
+                  </pic:spPr>
+                </pic:pic>
+              </a:graphicData>
+            </a:graphic>
+          </wp:inline>
+        </w:drawing>
+      </w:r>
+    </w:p>
+    <w:p>
+      <w:pPr>
+        <w:spacing w:after="240"/>
+        <w:jc w:val="center"/>
+      </w:pPr>
+      <w:r>
+        <w:rPr>
+          <w:rFonts w:ascii="Calibri" w:hAnsi="Calibri"/>
+          <w:i/>
+          <w:color w:val="4B5563"/>
+          <w:sz w:val="20"/>
+        </w:rPr>
+        <w:t>Figure 5: Sequence diagram - URL analysis (POST /api/predict)</w:t>
+      </w:r>
+    </w:p>
+    <w:p>
+      <w:pPr>
+        <w:spacing w:line="276" w:lineRule="auto" w:after="120"/>
       </w:pPr>
       <w:r>
         <w:t>Figure 6 details the execution flow for deep content analysis (POST /api/analyze-content). In addition to lexical prediction, the Page Analyzer executes a strict Server-Side Request Forgery (SSRF) verification. If the URL resolves to loopback, broadcast, or private RFC-1918 networks, the request is halted with HTTP 400. Legitimate public endpoints are safely scraped to evaluate login forms, external assets, and SSL certificates.</w:t>
+      </w:r>
+    </w:p>
+    <w:p>
+      <w:pPr>
+        <w:spacing w:before="160" w:after="40"/>
+        <w:jc w:val="center"/>
+      </w:pPr>
+      <w:r>
+        <w:drawing>
+          <wp:inline xmlns:a="http://schemas.openxmlformats.org/drawingml/2006/main" xmlns:pic="http://schemas.openxmlformats.org/drawingml/2006/picture">
+            <wp:extent cx="5029200" cy="5029200"/>
+            <wp:docPr id="6" name="Picture 6"/>
+            <wp:cNvGraphicFramePr>
+              <a:graphicFrameLocks noChangeAspect="1"/>
+            </wp:cNvGraphicFramePr>
+            <a:graphic>
+              <a:graphicData uri="http://schemas.openxmlformats.org/drawingml/2006/picture">
+                <pic:pic>
+                  <pic:nvPicPr>
+                    <pic:cNvPr id="0" name="page_8_img_1_Image32.png"/>
+                    <pic:cNvPicPr/>
+                  </pic:nvPicPr>
+                  <pic:blipFill>
+                    <a:blip r:embed="rId14"/>
+                    <a:stretch>
+                      <a:fillRect/>
+                    </a:stretch>
+                  </pic:blipFill>
+                  <pic:spPr>
+                    <a:xfrm>
+                      <a:off x="0" y="0"/>
+                      <a:ext cx="5029200" cy="5029200"/>
+                    </a:xfrm>
+                    <a:prstGeom prst="rect"/>
+                  </pic:spPr>
+                </pic:pic>
+              </a:graphicData>
+            </a:graphic>
+          </wp:inline>
+        </w:drawing>
+      </w:r>
+    </w:p>
+    <w:p>
+      <w:pPr>
+        <w:spacing w:after="240"/>
+        <w:jc w:val="center"/>
+      </w:pPr>
+      <w:r>
+        <w:rPr>
+          <w:rFonts w:ascii="Calibri" w:hAnsi="Calibri"/>
+          <w:i/>
+          <w:color w:val="4B5563"/>
+          <w:sz w:val="20"/>
+        </w:rPr>
+        <w:t>Figure 6: Sequence diagram - Deep content analysis (POST /api/analyze-content)</w:t>
       </w:r>
     </w:p>
     <w:p>

</xml_diff>